<commit_message>
Complete APA 7th author lists for five previously abbreviated references.
Replace et al. in the reference list with verified full author names for Gong, Hugar, Jaballah, Sasikala, and Zohir. Gong is dated 2024 (ICDE); Jaballah pages and Zohir article number are corrected to the published records.

Co-authored-by: Freshia Njoki <Freshia-Njoki@users.noreply.github.com>
</commit_message>
<xml_diff>
--- a/docs/Macharia_GRU_Emergency_Routing_Article.docx
+++ b/docs/Macharia_GRU_Emergency_Routing_Article.docx
@@ -532,7 +532,7 @@
           <w:i w:val="0"/>
           <w:sz w:val="24"/>
         </w:rPr>
-        <w:t xml:space="preserve"> Dijkstra (1959) and A* (Hart et al., 1968) remain the operational standard in many computer-aided dispatch stacks (Hagberg et al., 2024). Bidirectional search, contraction hierarchies, and landmark heuristics accelerate static queries but assume weights that do not jump every five minutes (Gong et al., 2023). Those accelerators are not withdrawn; they solve a different problem. The present artefact needs a searcher that remains correct when every edge weight is rewritten from a 30-minute forecast at detector resolution.</w:t>
+        <w:t xml:space="preserve"> Dijkstra (1959) and A* (Hart et al., 1968) remain the operational standard in many computer-aided dispatch stacks (Hagberg et al., 2024). Bidirectional search, contraction hierarchies, and landmark heuristics accelerate static queries but assume weights that do not jump every five minutes (Gong et al., 2024). Those accelerators are not withdrawn; they solve a different problem. The present artefact needs a searcher that remains correct when every edge weight is rewritten from a 30-minute forecast at detector resolution.</w:t>
       </w:r>
     </w:p>
     <w:p>
@@ -6139,7 +6139,7 @@
           <w:i w:val="0"/>
           <w:sz w:val="22"/>
         </w:rPr>
-        <w:t xml:space="preserve">Gong, Z., et al. (2023). Querying shortest path on large time-dependent road networks with shortcuts. In </w:t>
+        <w:t xml:space="preserve">Gong, Z., Zeng, Y., &amp; Chen, L. (2024). Querying shortest path on large time-dependent road networks with shortcuts. In </w:t>
       </w:r>
       <w:r>
         <w:rPr>
@@ -6148,7 +6148,7 @@
           <w:i/>
           <w:sz w:val="22"/>
         </w:rPr>
-        <w:t>Proceedings of IEEE ICDE</w:t>
+        <w:t>Proceedings of the 2024 IEEE 40th International Conference on Data Engineering (ICDE)</w:t>
       </w:r>
       <w:r>
         <w:rPr>
@@ -6157,7 +6157,7 @@
           <w:i w:val="0"/>
           <w:sz w:val="22"/>
         </w:rPr>
-        <w:t>.</w:t>
+        <w:t xml:space="preserve"> (pp. 4532–4544). IEEE. https://doi.org/10.1109/ICDE60146.2024.00345</w:t>
       </w:r>
     </w:p>
     <w:p>
@@ -6275,7 +6275,7 @@
           <w:i w:val="0"/>
           <w:sz w:val="22"/>
         </w:rPr>
-        <w:t xml:space="preserve">Hugar, S. M., et al. (2025). Real-time adaptive traffic management system for emergency vehicle prioritisation. In </w:t>
+        <w:t xml:space="preserve">Hugar, S. M., Prabaharan, S. I., Priyadharshini, S., Sheeba, D., Patturose, J. G. B., &amp; Allada, S. R. (2025). Real-time adaptive traffic management system for emergency vehicle prioritisation. In </w:t>
       </w:r>
       <w:r>
         <w:rPr>
@@ -6284,7 +6284,7 @@
           <w:i/>
           <w:sz w:val="22"/>
         </w:rPr>
-        <w:t>Proceedings of IEEE CNC</w:t>
+        <w:t>Proceedings of the 2025 IEEE International Conference on Communication Networks and Computing (CNC)</w:t>
       </w:r>
       <w:r>
         <w:rPr>
@@ -6293,7 +6293,7 @@
           <w:i w:val="0"/>
           <w:sz w:val="22"/>
         </w:rPr>
-        <w:t>.</w:t>
+        <w:t xml:space="preserve"> (pp. 1237–1242). IEEE. https://doi.org/10.1109/CNC68716.2025.11484833</w:t>
       </w:r>
     </w:p>
     <w:p>
@@ -6411,7 +6411,7 @@
           <w:i w:val="0"/>
           <w:sz w:val="22"/>
         </w:rPr>
-        <w:t xml:space="preserve">Jaballah, R., et al. (2021). The time-dependent shortest path and vehicle routing problem. </w:t>
+        <w:t xml:space="preserve">Jaballah, R., Veenstra, M., Coelho, L. C., &amp; Renaud, J. (2021). The time-dependent shortest path and vehicle routing problem. </w:t>
       </w:r>
       <w:r>
         <w:rPr>
@@ -6429,7 +6429,7 @@
           <w:i w:val="0"/>
           <w:sz w:val="22"/>
         </w:rPr>
-        <w:t>(3), 386–413.</w:t>
+        <w:t>(4), 592–622. https://doi.org/10.1080/03155986.2021.1973785</w:t>
       </w:r>
     </w:p>
     <w:p>
@@ -6717,7 +6717,7 @@
           <w:i w:val="0"/>
           <w:sz w:val="22"/>
         </w:rPr>
-        <w:t xml:space="preserve">Sasikala, N., et al. (2025). Emergency traffic prioritization system with priority-based dynamic route optimization. In </w:t>
+        <w:t xml:space="preserve">Sasikala, N., Sridhar, S., Reddy, S. H., John, S., &amp; Shrinikethan, S. (2025). Emergency traffic prioritization system with priority-based dynamic route optimization and IoT-enabled dynamic signal control. In </w:t>
       </w:r>
       <w:r>
         <w:rPr>
@@ -6726,7 +6726,7 @@
           <w:i/>
           <w:sz w:val="22"/>
         </w:rPr>
-        <w:t>Proceedings of IEEE CONIT</w:t>
+        <w:t>Proceedings of the 2025 5th International Conference on Intelligent Technologies (CONIT)</w:t>
       </w:r>
       <w:r>
         <w:rPr>
@@ -6735,7 +6735,7 @@
           <w:i w:val="0"/>
           <w:sz w:val="22"/>
         </w:rPr>
-        <w:t>.</w:t>
+        <w:t>. IEEE. https://doi.org/10.1109/CONIT65521.2025.11166819</w:t>
       </w:r>
     </w:p>
     <w:p>
@@ -6989,7 +6989,7 @@
           <w:i w:val="0"/>
           <w:sz w:val="22"/>
         </w:rPr>
-        <w:t xml:space="preserve">Zohir, H. M., et al. (2025). Advancements in accident-aware traffic management: A comprehensive review of V2X-based route optimization. </w:t>
+        <w:t xml:space="preserve">Zohir, H. M., Ismael, I. M., El-Gendy, E. M., &amp; Saafan, M. M. (2025). Advancements in accident-aware traffic management: A comprehensive review of V2X-based route optimization. </w:t>
       </w:r>
       <w:r>
         <w:rPr>
@@ -7007,7 +7007,7 @@
           <w:i w:val="0"/>
           <w:sz w:val="22"/>
         </w:rPr>
-        <w:t>, 2847.</w:t>
+        <w:t>, 35041. https://doi.org/10.1038/s41598-025-20878-x</w:t>
       </w:r>
     </w:p>
     <w:sectPr>

</xml_diff>